<commit_message>
Record W3 advisor decisions
</commit_message>
<xml_diff>
--- a/docs/03-lit-req-brief/Literature-and-Requirements-Brief.docx
+++ b/docs/03-lit-req-brief/Literature-and-Requirements-Brief.docx
@@ -431,7 +431,7 @@
               <w:rPr>
                 <w:sz w:val="16"/>
               </w:rPr>
-              <w:t>1.0 draft</w:t>
+              <w:t>1.1 advisor-reviewed decisions recorded</w:t>
             </w:r>
           </w:p>
         </w:tc>
@@ -465,7 +465,7 @@
               <w:rPr>
                 <w:sz w:val="16"/>
               </w:rPr>
-              <w:t>2026-05-25</w:t>
+              <w:t>2026-05-27</w:t>
             </w:r>
           </w:p>
         </w:tc>
@@ -534,6 +534,40 @@
                 <w:sz w:val="16"/>
               </w:rPr>
               <w:t>W1 annotated bibliography and W2 proposal scope</w:t>
+            </w:r>
+          </w:p>
+        </w:tc>
+      </w:tr>
+      <w:tr>
+        <w:tc>
+          <w:tcPr>
+            <w:tcW w:type="dxa" w:w="5040"/>
+          </w:tcPr>
+          <w:p>
+            <w:pPr>
+              <w:spacing w:after="0"/>
+            </w:pPr>
+            <w:r>
+              <w:rPr>
+                <w:sz w:val="16"/>
+              </w:rPr>
+              <w:t>Advisor-review status</w:t>
+            </w:r>
+          </w:p>
+        </w:tc>
+        <w:tc>
+          <w:tcPr>
+            <w:tcW w:type="dxa" w:w="5040"/>
+          </w:tcPr>
+          <w:p>
+            <w:pPr>
+              <w:spacing w:after="0"/>
+            </w:pPr>
+            <w:r>
+              <w:rPr>
+                <w:sz w:val="16"/>
+              </w:rPr>
+              <w:t>Confirmed with Prof. Khalid Lateef on 2026-05-27</w:t>
             </w:r>
           </w:p>
         </w:tc>
@@ -565,12 +599,12 @@
         <w:t>POST /execute</w:t>
       </w:r>
       <w:r>
-        <w:t xml:space="preserve"> API for Python 3.11, a hardened-Docker backend, a gVisor backend, a functional corpus, a hand-authored adversarial corpus, and a benchmark harness that reports isolation and performance evidence.</w:t>
+        <w:t xml:space="preserve"> API for Python 3.11, a hardened-Docker backend, a gVisor backend, a HumanEval/MBPP-informed functional corpus, a hand-authored adversarial corpus, and a benchmark harness that reports isolation and performance evidence.</w:t>
       </w:r>
     </w:p>
     <w:p>
       <w:r>
-        <w:t>This brief translates the literature into implementable requirements, use cases, constraints, and source/data decisions. The requirements below preserve the W2 approved scope: Python-only, single-tenant, no network egress, no GPU, ephemeral per-request filesystem, Linux x86_64 host, and two isolation backends unless the W7 midpoint review activates the documented fallback.</w:t>
+        <w:t>This brief translates the literature into implementable requirements, use cases, constraints, and source/data decisions. The requirements below preserve the W2 approved scope: Python-only, single-tenant, no network egress, no GPU, ephemeral per-request filesystem, Linux x86_64 host, and two isolation backends unless the W7 midpoint review activates the documented fallback. These W3 requirements, thresholds, and the W7 fallback plan were confirmed with Prof. Khalid Lateef on 2026-05-27.</w:t>
       </w:r>
     </w:p>
     <w:p>
@@ -4140,7 +4174,7 @@
               <w:rPr>
                 <w:sz w:val="16"/>
               </w:rPr>
-              <w:t>Use hand-authored fallback if HumanEval/MBPP reuse creates ambiguity.</w:t>
+              <w:t>Use HumanEval/MBPP subsets from upstream sources, record task IDs and provenance, preserve required license notices, and avoid vendoring full datasets unless needed for reproducibility.</w:t>
             </w:r>
           </w:p>
         </w:tc>
@@ -4506,7 +4540,7 @@
               <w:rPr>
                 <w:sz w:val="16"/>
               </w:rPr>
-              <w:t>The repository warns that model-generated code is untrusted; license and exact reuse terms must be preserved.</w:t>
+              <w:t>The repository warns that model-generated code is untrusted; MIT license and exact reuse terms must be preserved.</w:t>
             </w:r>
           </w:p>
         </w:tc>
@@ -4522,7 +4556,7 @@
               <w:rPr>
                 <w:sz w:val="16"/>
               </w:rPr>
-              <w:t>Candidate seed for functional tests; use subset only after license file is recorded.</w:t>
+              <w:t>Use a documented subset as a functional-test seed; include upstream citation and MIT license notice with any copied task material.</w:t>
             </w:r>
           </w:p>
         </w:tc>
@@ -4604,7 +4638,7 @@
               <w:rPr>
                 <w:sz w:val="16"/>
               </w:rPr>
-              <w:t>Crowd-sourced tasks may be simpler than realistic agent code; license/provenance must be carried.</w:t>
+              <w:t>Crowd-sourced tasks may be simpler than realistic agent code; Google Research repository is Apache-2.0 at the repo level, so provenance/license handling must be explicit.</w:t>
             </w:r>
           </w:p>
         </w:tc>
@@ -4620,7 +4654,7 @@
               <w:rPr>
                 <w:sz w:val="16"/>
               </w:rPr>
-              <w:t>Optional functional seed; not required if hand-authored suite reaches 100.</w:t>
+              <w:t>Use a documented subset as a second functional-test seed; prefer upstream Google Research source and include Apache-2.0 notice with any copied task material.</w:t>
             </w:r>
           </w:p>
         </w:tc>
@@ -6040,7 +6074,7 @@
     </w:p>
     <w:p>
       <w:r>
-        <w:t>The following items should be reviewed with Prof. Khalid Lateef before implementation details harden in W4:</w:t>
+        <w:t>The following items were reviewed after the W3 draft and recorded on 2026-05-27:</w:t>
       </w:r>
     </w:p>
     <w:p>
@@ -6048,7 +6082,7 @@
         <w:pStyle w:val="ListNumber"/>
       </w:pPr>
       <w:r>
-        <w:t>Confirm that the narrowed scope remains acceptable: Python-only, no network, no GPU, single-tenant, Linux x86_64.</w:t>
+        <w:t>Prof. Khalid Lateef confirmed that the W3 requirements and W7 fallback plan are acceptable.</w:t>
       </w:r>
     </w:p>
     <w:p>
@@ -6056,7 +6090,7 @@
         <w:pStyle w:val="ListNumber"/>
       </w:pPr>
       <w:r>
-        <w:t>Confirm that the adversarial-suite contribution is framed as a defensive benchmark and not as exploit publication.</w:t>
+        <w:t>The functional corpus will use documented HumanEval and MBPP subsets, supplemented by student-authored functional tests.</w:t>
       </w:r>
     </w:p>
     <w:p>
@@ -6064,7 +6098,7 @@
         <w:pStyle w:val="ListNumber"/>
       </w:pPr>
       <w:r>
-        <w:t>Confirm that the W7 fallback remains acceptable if gVisor integration slips.</w:t>
+        <w:t>The numeric targets remain unchanged: &gt;=99% functional pass rate, &gt;=90% Docker adversarial containment, &gt;=95% gVisor adversarial containment, and &gt;=30 benchmark samples per condition.</w:t>
       </w:r>
     </w:p>
     <w:p>
@@ -6072,7 +6106,7 @@
         <w:pStyle w:val="ListNumber"/>
       </w:pPr>
       <w:r>
-        <w:t>Review whether the functional corpus should use HumanEval/MBPP subsets or remain fully hand-authored.</w:t>
+        <w:t>The gVisor fallback is confirmed: if integration slips, W7 is the decision point for dropping gVisor and preserving the Docker-plus-benchmark contribution.</w:t>
       </w:r>
     </w:p>
     <w:p>
@@ -6080,7 +6114,7 @@
         <w:pStyle w:val="ListNumber"/>
       </w:pPr>
       <w:r>
-        <w:t>Review numeric thresholds for contained-outcome rates and benchmark sample counts.</w:t>
+        <w:t>The adversarial-suite disclosure plan is confirmed: publish category taxonomy early, then publish full program details later with containment context.</w:t>
       </w:r>
     </w:p>
     <w:p>
@@ -6088,37 +6122,7 @@
         <w:pStyle w:val="ListNumber"/>
       </w:pPr>
       <w:r>
-        <w:t xml:space="preserve">Identify any missing domain constraints before </w:t>
-      </w:r>
-      <w:r>
-        <w:rPr>
-          <w:rFonts w:ascii="Menlo" w:hAnsi="Menlo"/>
-          <w:sz w:val="17"/>
-        </w:rPr>
-        <w:t>docs/design/architecture.md</w:t>
-      </w:r>
-      <w:r>
-        <w:t xml:space="preserve">, </w:t>
-      </w:r>
-      <w:r>
-        <w:rPr>
-          <w:rFonts w:ascii="Menlo" w:hAnsi="Menlo"/>
-          <w:sz w:val="17"/>
-        </w:rPr>
-        <w:t>threat-model.md</w:t>
-      </w:r>
-      <w:r>
-        <w:t xml:space="preserve">, and </w:t>
-      </w:r>
-      <w:r>
-        <w:rPr>
-          <w:rFonts w:ascii="Menlo" w:hAnsi="Menlo"/>
-          <w:sz w:val="17"/>
-        </w:rPr>
-        <w:t>evaluation-plan.md</w:t>
-      </w:r>
-      <w:r>
-        <w:t xml:space="preserve"> are written in W4.</w:t>
+        <w:t>License/data reuse decision: use upstream HumanEval/MBPP subsets conservatively, record task IDs and provenance, preserve required license notices, and avoid vendoring full datasets unless necessary for reproducibility.</w:t>
       </w:r>
     </w:p>
     <w:p>

</xml_diff>